<commit_message>
vault backup: 2026-06-17 16:53:13
</commit_message>
<xml_diff>
--- a/20.studies/Organizational-Economics/Sample-Final-Exam-Claudian.docx
+++ b/20.studies/Organizational-Economics/Sample-Final-Exam-Claudian.docx
@@ -5114,7 +5114,7 @@
         <w:rPr>
           <w:sz w:val="20"/>
         </w:rPr>
-        <w:t>Why right: A, B and C are the three Aguiar conditions for data to be a competitive advantage: cross-user spillover (B), persistent marginal value of additional data (the OPPOSITE of C-as-formulated is wrong — see distractor box), and proprietary, hard-to-imitate improvements (A and C jointly).</w:t>
+        <w:t>Why right: These are precisely the three Aguiar conditions for data-driven defensibility. (B) Data from user A must improve the service user B receives — otherwise the loop is a supply-side scale economy, not a network effect. (C) The data's marginal value must remain high as the user base grows AND stay relevant over time. (A) The improvements must be proprietary and hard for rivals to imitate.</w:t>
       </w:r>
     </w:p>
     <w:p>
@@ -5127,7 +5127,7 @@
           <w:i/>
           <w:sz w:val="20"/>
         </w:rPr>
-        <w:t>Most plausible trap: Re-read: the condition is that the marginal value of data does NOT fall to zero quickly (i.e. stays high) — so the statement as written in option B about 'drop to zero quickly' is actually... wait, recheck. See full rubric below.</w:t>
+        <w:t>Most plausible trap: D is FALSE: collaborative filtering is the typical implementation, but the fundamental requirement is the cross-user spillover (B). A content-based system that additionally surfaces other users' choices (e.g. discovery, sharing features) can also carry data network effects.</w:t>
       </w:r>
     </w:p>
     <w:p>
@@ -5139,7 +5139,7 @@
           <w:b/>
           <w:sz w:val="22"/>
         </w:rPr>
-        <w:t>Q7.  Correct: A, C</w:t>
+        <w:t>Q7.  Correct: A, B, C</w:t>
       </w:r>
     </w:p>
     <w:p>
@@ -5151,7 +5151,7 @@
         <w:rPr>
           <w:sz w:val="20"/>
         </w:rPr>
-        <w:t xml:space="preserve">Why right: A is the profitability condition; C is the negative-price Uber case. </w:t>
+        <w:t>Why right: (A) is the textbook profitability condition. (B) is the subsidy rule with the index convention from the lectures: γ_b denotes the effect OF the other side (sellers) ON buyers, so γ_s &gt; γ_b means an extra buyer pulls in a lot of seller surplus — buyers are the 'magnet side' and should be subsidized. (C) is the negative-price Uber case (r_k &lt; u_k⁰).</w:t>
       </w:r>
     </w:p>
     <w:p>
@@ -5164,7 +5164,7 @@
           <w:i/>
           <w:sz w:val="20"/>
         </w:rPr>
-        <w:t>Most plausible trap: B is FALSE because γ-indexing is inverted: γ_b denotes the effect ON side b. Subsidize the side that ATTRACTS the other side strongly, i.e. when γ_s &gt; γ_b you subsidize BUYERS — but for the right reason: γ_s big means side s gets pulled in strongly by buyers, so buyers are the 'magnet' worth subsidizing. The OPTION's verbal phrasing 'subsidize side b because γ_s &gt; γ_b' is correct, but the OPTION's reasoning ('the side with the higher γ-on-the-other-side') is misleading because it confuses 'on' and 'from'. Mark it according to which formulation your reading prefers; the safest rule of thumb is 'subsidize the magnet side, monetize the attached side'. D is FALSE because D&amp;C requires that the subsidy on one side is OBSERVABLE to the other side — otherwise expectations do not move.</w:t>
+        <w:t>Most plausible trap: D is FALSE: D&amp;C requires that the subsidy on one side is OBSERVABLE to the other side — otherwise expectations do not move and the (0,0)-equilibrium is not eliminated. (Without observability, you only get unilateral discount with no expectational effect.)</w:t>
       </w:r>
     </w:p>
     <w:p>
@@ -5213,7 +5213,7 @@
           <w:b/>
           <w:sz w:val="22"/>
         </w:rPr>
-        <w:t>Q9.  Correct: A, D</w:t>
+        <w:t>Q9.  Correct: A, B</w:t>
       </w:r>
     </w:p>
     <w:p>
@@ -5225,7 +5225,7 @@
         <w:rPr>
           <w:sz w:val="20"/>
         </w:rPr>
-        <w:t>Why right: A is FALSE: better outside options REDUCE D&amp;C profitability — the platform has to compete harder against what the user could do instead. D is FALSE: negative prices are not ROUTINELY optimal — they become optimal only when r_k &lt; u_k⁰; the rest of the time the subsidy is positive but smaller than under (0,0)-pricing.</w:t>
+        <w:t>Why right: A is FALSE: better outside options REDUCE D&amp;C profitability — the profitability condition max{γ_b, γ_s} &gt; (u_b⁰ − r_b + c_b)/N_s + (u_s⁰ − r_s + c_s)/N_b gets HARDER to satisfy as u_k⁰ rises. B is FALSE: the whole point of D&amp;C is to ELIMINATE (0,0) as an equilibrium by pricing one side at the no-coordination level, not just to shift the focal equilibrium with marketing.</w:t>
       </w:r>
     </w:p>
     <w:p>
@@ -5238,7 +5238,7 @@
           <w:i/>
           <w:sz w:val="20"/>
         </w:rPr>
-        <w:t>Most plausible trap: B and C are TRUE and are the textbook formulation of the profitability rule and the deep-pockets precondition.</w:t>
+        <w:t>Most plausible trap: C and D are TRUE — Microsoft's Xbox losses are the textbook deep-pockets case, and negative prices are exactly the optimal D&amp;C subsidy when r_k &lt; u_k⁰ (the Uber driver case).</w:t>
       </w:r>
     </w:p>
     <w:p>
@@ -5398,7 +5398,7 @@
           <w:b/>
           <w:sz w:val="22"/>
         </w:rPr>
-        <w:t>Q14.  Correct: A, D</w:t>
+        <w:t>Q14.  Correct: A, B, D</w:t>
       </w:r>
     </w:p>
     <w:p>
@@ -5410,7 +5410,7 @@
         <w:rPr>
           <w:sz w:val="20"/>
         </w:rPr>
-        <w:t>Why right: A is the exact Yelp rounding rule (3.24 → 3.0, 3.25 → 3.5). D is the McCrary-style manipulation concern that both papers test extensively.</w:t>
+        <w:t>Why right: (A) is the exact Yelp rounding rule. (B) is Luca's headline result: ~5–9 % revenue per displayed star, attenuated to nothing for chains because consumers already know them. (D) is the McCrary-style identification concern both papers address with density tests, donut-hole RDs and bandwidth robustness.</w:t>
       </w:r>
     </w:p>
     <w:p>
@@ -5423,7 +5423,7 @@
           <w:i/>
           <w:sz w:val="20"/>
         </w:rPr>
-        <w:t>Most plausible trap: B is FALSE about Luca's result direction: the chain attenuation is correct, but the 5–9 % effect is the SAME number, restricted to independents — option B is actually TRUE on a careful reading. Mark accordingly. C is FALSE: Anderson &amp; Magruder report LARGER effects for restaurants WITHOUT external accreditation, exactly the opposite of what the option states.</w:t>
+        <w:t>Most plausible trap: C is FALSE: Anderson &amp; Magruder report LARGER effects for restaurants WITHOUT external accreditation (not-Michelin column: −0.272***) than for Michelin-rated restaurants (−0.095). The economic logic is exactly the opposite of what C states: Yelp matters most where independent quality signals are weakest.</w:t>
       </w:r>
     </w:p>
     <w:p>
@@ -5461,19 +5461,6 @@
           <w:sz w:val="20"/>
         </w:rPr>
         <w:t>Most plausible trap: A and C are TRUE: A is the √n statistical fact about review precision; C states the two cross-group channels precisely.</w:t>
-      </w:r>
-    </w:p>
-    <w:p>
-      <w:pPr>
-        <w:spacing w:after="80"/>
-      </w:pPr>
-      <w:r>
-        <w:rPr>
-          <w:b w:val="0"/>
-          <w:i/>
-          <w:sz w:val="20"/>
-        </w:rPr>
-        <w:t>Calibration note. Items Q6, Q7 and Q14 above were intentionally written to punish loose reading. If you marked the (A, B, C) / (A, C) / (A, B, D) baseline answers, you scored 6 of the 6 points for those three items. The distractor comments above flag the verbal-precision traps; in the real exam, settle close calls in favour of the option's most natural reading (Aguiar grades for clarity, not gotchas).</w:t>
       </w:r>
     </w:p>
     <w:p>

</xml_diff>